<commit_message>
Add Tooclarity experience and Mentorship section to BrightEdge resume
- New Tooclarity experience block (Project Manager, Institutional Outreach)
  framed for FinOps/PMO audience: pipeline discipline, follow-ups, CRM,
  multi-stakeholder coordination
- New Mentorship & Community Engagement section (college-to-corporate
  mentoring, skill development sessions, 1:1 career pathing)
- No DEI content - this is the BrightEdge Cloud Cost Operations resume
- Updated change log with v2 deltas
- Still 2 pages
</commit_message>
<xml_diff>
--- a/resumes/tailored/brightedge_cloud-finops-pmo_2026-05-25.docx
+++ b/resumes/tailored/brightedge_cloud-finops-pmo_2026-05-25.docx
@@ -420,6 +420,96 @@
           <w:b/>
           <w:sz w:val="22"/>
         </w:rPr>
+        <w:t>Tooclarity (tooclarity.com)</w:t>
+      </w:r>
+      <w:r>
+        <w:rPr>
+          <w:sz w:val="20"/>
+        </w:rPr>
+        <w:t xml:space="preserve">  |  Hyderabad, India (travel across India)</w:t>
+      </w:r>
+    </w:p>
+    <w:p>
+      <w:pPr>
+        <w:spacing w:after="40"/>
+      </w:pPr>
+      <w:r>
+        <w:rPr>
+          <w:b/>
+          <w:i/>
+          <w:sz w:val="20"/>
+        </w:rPr>
+        <w:t>Project Manager — Institutional Outreach &amp; Onboarding</w:t>
+      </w:r>
+      <w:r>
+        <w:rPr>
+          <w:i/>
+          <w:sz w:val="20"/>
+        </w:rPr>
+        <w:t xml:space="preserve">    2025 (project engagement)</w:t>
+      </w:r>
+    </w:p>
+    <w:p>
+      <w:pPr>
+        <w:pStyle w:val="ListBullet"/>
+        <w:spacing w:after="40"/>
+        <w:ind w:left="288"/>
+      </w:pPr>
+      <w:r>
+        <w:rPr>
+          <w:sz w:val="20"/>
+        </w:rPr>
+        <w:t>Partnered with the founder on go-to-market for institutional onboarding at Tooclarity, an India-based education-discovery platform — visited colleges and educational institutions in person, pitched the platform's value proposition to deans and decision-makers, and closed listing agreements (RFP-style wins at startup scale).</w:t>
+      </w:r>
+    </w:p>
+    <w:p>
+      <w:pPr>
+        <w:pStyle w:val="ListBullet"/>
+        <w:spacing w:after="40"/>
+        <w:ind w:left="288"/>
+      </w:pPr>
+      <w:r>
+        <w:rPr>
+          <w:sz w:val="20"/>
+        </w:rPr>
+        <w:t>Brought PMO discipline to a founder-led environment: built and ran the outreach pipeline (prospect lists, meeting cadence, post-visit follow-ups) and a lightweight CRM for institutional commitments and renewal tracking — kept nothing slipping through the cracks in a fast-paced, multi-stakeholder setting.</w:t>
+      </w:r>
+    </w:p>
+    <w:p>
+      <w:pPr>
+        <w:pStyle w:val="ListBullet"/>
+        <w:spacing w:after="40"/>
+        <w:ind w:left="288"/>
+      </w:pPr>
+      <w:r>
+        <w:rPr>
+          <w:sz w:val="20"/>
+        </w:rPr>
+        <w:t>Coordinated between founders, operations, and onboarded institutions during launch — established weekly review cadence, status updates, and a shared backlog so commitments, dependencies, and follow-ups stayed visible across the team.</w:t>
+      </w:r>
+    </w:p>
+    <w:p>
+      <w:pPr>
+        <w:pStyle w:val="ListBullet"/>
+        <w:spacing w:after="40"/>
+        <w:ind w:left="288"/>
+      </w:pPr>
+      <w:r>
+        <w:rPr>
+          <w:sz w:val="20"/>
+        </w:rPr>
+        <w:t>Adapted pitch and process across diverse institution tiers and decision-making styles, building repeatable onboarding playbooks for newly partnered colleges and supporting the founder on positioning, pricing conversations, and partner-tier negotiations.</w:t>
+      </w:r>
+    </w:p>
+    <w:p>
+      <w:pPr>
+        <w:spacing w:after="0"/>
+      </w:pPr>
+      <w:r>
+        <w:rPr>
+          <w:b/>
+          <w:sz w:val="22"/>
+        </w:rPr>
         <w:t>Wells Fargo</w:t>
       </w:r>
       <w:r>
@@ -486,6 +576,61 @@
           <w:sz w:val="20"/>
         </w:rPr>
         <w:t>Performed QA on ATM debit, ACH, and cheque-fraud units — strengthened financial-controls posture and feedback loops for upstream operations teams.</w:t>
+      </w:r>
+    </w:p>
+    <w:p>
+      <w:pPr>
+        <w:spacing w:before="120" w:after="40"/>
+        <w:pBdr>
+          <w:bottom w:val="single" w:sz="6" w:space="1" w:color="999999"/>
+        </w:pBdr>
+      </w:pPr>
+      <w:r>
+        <w:rPr>
+          <w:b/>
+          <w:color w:val="1F3A5F"/>
+          <w:sz w:val="22"/>
+        </w:rPr>
+        <w:t>MENTORSHIP &amp; COMMUNITY ENGAGEMENT</w:t>
+      </w:r>
+    </w:p>
+    <w:p>
+      <w:pPr>
+        <w:pStyle w:val="ListBullet"/>
+        <w:spacing w:after="40"/>
+        <w:ind w:left="288"/>
+      </w:pPr>
+      <w:r>
+        <w:rPr>
+          <w:sz w:val="20"/>
+        </w:rPr>
+        <w:t>Mentored undergraduate and MBA students across Osmania University and partner colleges on the college-to-corporate transition — covered skill gaps, professional documentation, stakeholder communication, and pathways into PMO, consulting, and finance roles.</w:t>
+      </w:r>
+    </w:p>
+    <w:p>
+      <w:pPr>
+        <w:pStyle w:val="ListBullet"/>
+        <w:spacing w:after="40"/>
+        <w:ind w:left="288"/>
+      </w:pPr>
+      <w:r>
+        <w:rPr>
+          <w:sz w:val="20"/>
+        </w:rPr>
+        <w:t>Ran skill-development sessions bridging classroom learning to corporate expectations — interview prep, resume craft, workplace etiquette, and basic project / stakeholder skills — preparing students with corporate-ready capabilities before campus placements.</w:t>
+      </w:r>
+    </w:p>
+    <w:p>
+      <w:pPr>
+        <w:pStyle w:val="ListBullet"/>
+        <w:spacing w:after="40"/>
+        <w:ind w:left="288"/>
+      </w:pPr>
+      <w:r>
+        <w:rPr>
+          <w:sz w:val="20"/>
+        </w:rPr>
+        <w:t>Advised students through 1:1 conversations on career pathing into PMO, consulting, finance, and operations roles; built a small, ongoing peer network for follow-up support.</w:t>
       </w:r>
     </w:p>
     <w:p>

</xml_diff>